<commit_message>
Redige modelos de certificado e registro de batismo
Inclui certificado numerado, livro de registro de batismos e declaração
de segunda via; acrescenta o prazo de guarda do registro à Política de
Privacidade.

Co-Authored-By: Claude Opus 5.5 <noreply@anthropic.com>
Claude-Session: https://claude.ai/code/session_01BEp8NqqHQWjkMmYzbfUpgC
</commit_message>
<xml_diff>
--- a/estatuto-igreja/Politica_Privacidade_Protecao_Dados_Igreja_ISAC.docx
+++ b/estatuto-igreja/Politica_Privacidade_Protecao_Dados_Igreja_ISAC.docx
@@ -1438,6 +1438,53 @@
                 <w:sz w:val="19"/>
               </w:rPr>
               <w:t>Permanentemente</w:t>
+            </w:r>
+          </w:p>
+        </w:tc>
+        <w:tc>
+          <w:tcPr>
+            <w:tcW w:type="dxa" w:w="3024"/>
+          </w:tcPr>
+          <w:p>
+            <w:r/>
+            <w:r>
+              <w:rPr>
+                <w:b w:val="0"/>
+                <w:sz w:val="19"/>
+              </w:rPr>
+              <w:t>—</w:t>
+            </w:r>
+          </w:p>
+        </w:tc>
+      </w:tr>
+      <w:tr>
+        <w:tc>
+          <w:tcPr>
+            <w:tcW w:type="dxa" w:w="3024"/>
+          </w:tcPr>
+          <w:p>
+            <w:r/>
+            <w:r>
+              <w:rPr>
+                <w:b w:val="0"/>
+                <w:sz w:val="19"/>
+              </w:rPr>
+              <w:t>Livro de Registro de Batismos (nome, data de nascimento, filiação, data, local e ministro)</w:t>
+            </w:r>
+          </w:p>
+        </w:tc>
+        <w:tc>
+          <w:tcPr>
+            <w:tcW w:type="dxa" w:w="3024"/>
+          </w:tcPr>
+          <w:p>
+            <w:r/>
+            <w:r>
+              <w:rPr>
+                <w:b w:val="0"/>
+                <w:sz w:val="19"/>
+              </w:rPr>
+              <w:t>Permanentemente, como registro histórico da vida religiosa, com acesso restrito</w:t>
             </w:r>
           </w:p>
         </w:tc>

</xml_diff>